<commit_message>
Sync skill from my-skills, add roadmap and setup wizard scaffold
Sync SKILL.md and reference.docx to latest versions from my-skills repo
(added "Задание к лабораторной работе" section, fixed gray tables).
Restructure README for public release. Add docs/ROADMAP.md with full
development plan (6 phases). Add SETUP.md skeleton for setup wizard.
Prepare templates/universities/ for future university title pages.

Co-Authored-By: Claude Opus 4.6 (1M context) <noreply@anthropic.com>
</commit_message>
<xml_diff>
--- a/gost-lab-report/templates/reference.docx
+++ b/gost-lab-report/templates/reference.docx
@@ -1804,14 +1804,12 @@
         <w:ilvl w:val="2"/>
         <w:numId w:val="1"/>
       </w:numPr>
-      <w:spacing w:before="240" w:after="120"/>
+      <w:spacing w:before="0" w:after="0"/>
       <w:ind w:hanging="0" w:start="0"/>
       <w:outlineLvl w:val="2"/>
     </w:pPr>
     <w:rPr>
       <w:rFonts w:cs="Arial"/>
-      <w:b w:val="false"/>
-      <w:bCs w:val="false"/>
       <w:szCs w:val="26"/>
     </w:rPr>
   </w:style>
@@ -1829,12 +1827,11 @@
         <w:numId w:val="1"/>
       </w:numPr>
       <w:spacing w:before="0" w:after="0"/>
-      <w:ind w:hanging="1276" w:start="1985"/>
+      <w:ind w:hanging="0" w:start="0"/>
       <w:outlineLvl w:val="3"/>
     </w:pPr>
     <w:rPr>
       <w:bCs/>
-      <w:i/>
       <w:szCs w:val="28"/>
     </w:rPr>
   </w:style>
@@ -3807,6 +3804,50 @@
       <w:tcPr>
         <w:shd w:val="clear" w:color="auto" w:fill="F2F2F2" w:themeFill="background1" w:themeFillShade="f2"/>
       </w:tcPr>
+    </w:tblStylePr>
+  </w:style>
+  <w:style w:type="table" w:customStyle="1" w:styleId="Table">
+    <w:name w:val="Table"/>
+    <w:basedOn w:val="a3"/>
+    <w:uiPriority w:val="59"/>
+    <w:pPr>
+      <w:spacing w:after="0"/>
+      <w:jc w:val="center"/>
+    </w:pPr>
+    <w:rPr>
+      <w:sz w:val="24"/>
+    </w:rPr>
+    <w:tblPr>
+      <w:tblBorders>
+        <w:top w:val="single" w:color="000000" w:sz="4" w:space="0"/>
+        <w:left w:val="single" w:color="000000" w:sz="4" w:space="0"/>
+        <w:bottom w:val="single" w:color="000000" w:sz="4" w:space="0"/>
+        <w:right w:val="single" w:color="000000" w:sz="4" w:space="0"/>
+        <w:insideH w:val="single" w:color="000000" w:sz="4" w:space="0"/>
+        <w:insideV w:val="single" w:color="000000" w:sz="4" w:space="0"/>
+      </w:tblBorders>
+      <w:tblCellMar>
+        <w:top w:w="57" w:type="dxa"/>
+        <w:left w:w="57" w:type="dxa"/>
+        <w:bottom w:w="57" w:type="dxa"/>
+        <w:right w:w="57" w:type="dxa"/>
+      </w:tblCellMar>
+    </w:tblPr>
+    <w:tcPr>
+      <w:vAlign w:val="center"/>
+    </w:tcPr>
+    <w:tblStylePr w:type="firstRow">
+      <w:pPr>
+        <w:wordWrap/>
+        <w:jc w:val="center"/>
+      </w:pPr>
+      <w:rPr>
+        <w:b/>
+      </w:rPr>
+      <w:tblPr/>
+      <w:trPr>
+        <w:tblHeader/>
+      </w:trPr>
     </w:tblStylePr>
   </w:style>
 </w:styles>

</xml_diff>

<commit_message>
Sync skill v2: progressive disclosure (PROFILES/WIZARD/REVIEW), verify.py, title templates registry
- SKILL.md slimmed to core, profiles/wizard/review split into separate files
- scripts: verify.py (18 deterministic checks), update_fields.py (LibreOffice UNO auto-TOC + canonical styleId restore), build.py portability fixes (BOM, legacy console, soffice lookup, explicit LO warning)
- templates/title_pages: guap_lab, guap_course, spbgeu_course (wizard-built v2)
- drop stale SETUP.md and docs/ROADMAP.md (superseded by SKILL.md setup section and README)

Co-Authored-By: Claude Fable 5 <noreply@anthropic.com>
</commit_message>
<xml_diff>
--- a/gost-lab-report/templates/reference.docx
+++ b/gost-lab-report/templates/reference.docx
@@ -439,7 +439,7 @@
                 <w:sz w:val="28"/>
                 <w:szCs w:val="28"/>
               </w:rPr>
-              <w:t>ОТЧЕТ О ЛАБОРАТОРНОЙ РАБОТЕ № {{LAB_NUMBER}}</w:t>
+              <w:t>ОТЧЕТ О {{REPORT_TYPE}} № {{LAB_NUMBER}}</w:t>
             </w:r>
           </w:p>
         </w:tc>
@@ -2588,7 +2588,6 @@
     </w:pPr>
     <w:rPr>
       <w:rFonts w:eastAsia="MS Mincho" w:cs="" w:cstheme="minorBidi"/>
-      <w:b/>
       <w:szCs w:val="24"/>
     </w:rPr>
   </w:style>
@@ -2696,7 +2695,10 @@
       </w:tabs>
       <w:spacing w:before="0" w:after="160"/>
     </w:pPr>
-    <w:rPr/>
+    <w:rPr>
+      <w:sz w:val="24"/>
+      <w:szCs w:val="24"/>
+    </w:rPr>
   </w:style>
   <w:style w:type="paragraph" w:styleId="Title">
     <w:name w:val="Title"/>
@@ -3300,6 +3302,7 @@
       <w:spacing w:before="160" w:after="120"/>
     </w:pPr>
     <w:rPr>
+      <w:sz w:val="24"/>
       <w:rFonts w:eastAsia="Calibri" w:cs="" w:cstheme="minorBidi" w:eastAsiaTheme="minorHAnsi"/>
       <w:szCs w:val="24"/>
       <w:lang w:val="en-US" w:eastAsia="en-US"/>

</xml_diff>